<commit_message>
Align problem statement with final implementation
</commit_message>
<xml_diff>
--- a/docs/Problem_Statement_Revised.docx
+++ b/docs/Problem_Statement_Revised.docx
@@ -670,35 +670,11 @@
             </w:tcMar>
           </w:tcPr>
           <w:p>
-            <w:pPr/>
-            <w:r>
-              <w:rPr>
-                <w:sz w:val="19"/>
-              </w:rPr>
-              <w:t>I will build the application logic and evaluation code while using an existing hosted model API rather than training a foundation model from scratch. GPT-4o-mini will be used for model calls. The retrieval pipeline will include document chunking and similarity-based retrieval, with the open-source Chroma vector store. The first version will run in Google Colab because the project is intended to demonstrate the core AI workflow rather than a production front end.</w:t>
-            </w:r>
-            <w:r>
-              <w:rPr>
-                <w:sz w:val="19"/>
-              </w:rPr>
+            <w:r>
+              <w:t>I built the application logic and evaluation code while using an existing hosted model API rather than training a foundation model from scratch. The OpenRouter API model mode uses openai/gpt-4o-mini for model calls. The retrieval pipeline reads versioned Markdown policy files and uses document chunks, Chinese bigrams, English tokens, aliases, TF-IDF, and cosine similarity in Python. The final version runs as a local browser application: run python3 server.py and open http://127.0.0.1:8765. It demonstrates the core AI workflow with an English interface rather than a production deployment.</w:t>
               <w:br/>
-            </w:r>
-            <w:r>
-              <w:rPr>
-                <w:sz w:val="19"/>
-              </w:rPr>
-            </w:r>
-            <w:r>
-              <w:rPr>
-                <w:sz w:val="19"/>
-              </w:rPr>
               <w:br/>
-            </w:r>
-            <w:r>
-              <w:rPr>
-                <w:sz w:val="19"/>
-              </w:rPr>
-              <w:t>The build-versus-buy trade-off is mixed: I own the HR documents, retrieval workflow, prompts, intent logic, ticket schema, and evaluation, while renting the foundation model through an API. Model cost will be tracked as estimated cost per query using actual token usage and the applicable API pricing at evaluation time.</w:t>
+              <w:t>The build-versus-buy trade-off is mixed: I own the HR documents, retrieval workflow, prompts, intent logic, ticket schema, and evaluation, while renting the foundation model through an API. Model cost is tracked as estimated cost per query using actual token usage and applicable API pricing at evaluation time.</w:t>
             </w:r>
           </w:p>
         </w:tc>

</xml_diff>

<commit_message>
Restore original problem statement spacing
</commit_message>
<xml_diff>
--- a/docs/Problem_Statement_Revised.docx
+++ b/docs/Problem_Statement_Revised.docx
@@ -4,7 +4,7 @@
   <w:body>
     <w:p>
       <w:pPr>
-        <w:spacing w:after="20" w:line="360" w:lineRule="auto"/>
+        <w:spacing w:after="20"/>
       </w:pPr>
       <w:r>
         <w:rPr>
@@ -19,7 +19,7 @@
     </w:p>
     <w:p>
       <w:pPr>
-        <w:spacing w:after="26" w:line="360" w:lineRule="auto"/>
+        <w:spacing w:after="26"/>
       </w:pPr>
       <w:r>
         <w:rPr>
@@ -37,7 +37,7 @@
         <w:pBdr>
           <w:bottom w:val="single" w:color="1F3864" w:sz="10" w:space="0"/>
         </w:pBdr>
-        <w:spacing w:after="80" w:line="360" w:lineRule="auto"/>
+        <w:spacing w:after="80"/>
         <w:rPr>
           <w:i/>
           <w:iCs/>
@@ -74,7 +74,7 @@
         <w:pBdr>
           <w:bottom w:val="single" w:color="1F3864" w:sz="10" w:space="0"/>
         </w:pBdr>
-        <w:spacing w:after="80" w:line="360" w:lineRule="auto"/>
+        <w:spacing w:after="80"/>
         <w:rPr>
           <w:b/>
           <w:bCs/>
@@ -100,7 +100,7 @@
     </w:p>
     <w:p>
       <w:pPr>
-        <w:spacing w:after="60" w:line="360" w:lineRule="auto"/>
+        <w:spacing w:after="60"/>
       </w:pPr>
       <w:r>
         <w:rPr>
@@ -231,7 +231,7 @@
     </w:p>
     <w:p>
       <w:pPr>
-        <w:spacing w:before="170" w:after="20" w:line="360" w:lineRule="auto"/>
+        <w:spacing w:before="170" w:after="20"/>
       </w:pPr>
       <w:r>
         <w:rPr>
@@ -246,7 +246,7 @@
     </w:p>
     <w:p>
       <w:pPr>
-        <w:spacing w:after="40" w:line="360" w:lineRule="auto"/>
+        <w:spacing w:after="40"/>
       </w:pPr>
       <w:r>
         <w:rPr>
@@ -296,9 +296,7 @@
             </w:tcMar>
           </w:tcPr>
           <w:p>
-            <w:pPr>
-              <w:spacing w:line="360" w:lineRule="auto"/>
-            </w:pPr>
+            <w:pPr/>
             <w:r>
               <w:rPr>
                 <w:sz w:val="19"/>
@@ -311,7 +309,7 @@
     </w:tbl>
     <w:p>
       <w:pPr>
-        <w:spacing w:before="170" w:after="20" w:line="360" w:lineRule="auto"/>
+        <w:spacing w:before="170" w:after="20"/>
       </w:pPr>
       <w:r>
         <w:rPr>
@@ -326,7 +324,7 @@
     </w:p>
     <w:p>
       <w:pPr>
-        <w:spacing w:after="40" w:line="360" w:lineRule="auto"/>
+        <w:spacing w:after="40"/>
       </w:pPr>
       <w:r>
         <w:rPr>
@@ -376,9 +374,7 @@
             </w:tcMar>
           </w:tcPr>
           <w:p>
-            <w:pPr>
-              <w:spacing w:line="360" w:lineRule="auto"/>
-            </w:pPr>
+            <w:pPr/>
             <w:r>
               <w:rPr>
                 <w:sz w:val="19"/>
@@ -391,7 +387,7 @@
     </w:tbl>
     <w:p>
       <w:pPr>
-        <w:spacing w:before="170" w:after="20" w:line="360" w:lineRule="auto"/>
+        <w:spacing w:before="170" w:after="20"/>
       </w:pPr>
       <w:r>
         <w:rPr>
@@ -406,7 +402,7 @@
     </w:p>
     <w:p>
       <w:pPr>
-        <w:spacing w:after="40" w:line="360" w:lineRule="auto"/>
+        <w:spacing w:after="40"/>
       </w:pPr>
       <w:r>
         <w:rPr>
@@ -460,7 +456,6 @@
           </w:tcPr>
           <w:p>
             <w:pPr>
-              <w:spacing w:line="360" w:lineRule="auto"/>
               <w:rPr>
                 <w:rFonts w:hint="default" w:ascii="Times New Roman Regular" w:hAnsi="Times New Roman Regular" w:cs="Times New Roman Regular"/>
               </w:rPr>
@@ -501,7 +496,7 @@
     </w:tbl>
     <w:p>
       <w:pPr>
-        <w:spacing w:before="170" w:after="20" w:line="360" w:lineRule="auto"/>
+        <w:spacing w:before="170" w:after="20"/>
       </w:pPr>
       <w:r>
         <w:rPr>
@@ -516,7 +511,7 @@
     </w:p>
     <w:p>
       <w:pPr>
-        <w:spacing w:after="40" w:line="360" w:lineRule="auto"/>
+        <w:spacing w:after="40"/>
       </w:pPr>
       <w:r>
         <w:rPr>
@@ -567,7 +562,6 @@
           </w:tcPr>
           <w:p>
             <w:pPr>
-              <w:spacing w:line="360" w:lineRule="auto"/>
               <w:rPr>
                 <w:rFonts w:hint="default" w:ascii="Times New Roman Regular" w:hAnsi="Times New Roman Regular" w:eastAsia="宋体" w:cs="Times New Roman Regular"/>
                 <w:lang w:val="en-US" w:eastAsia="zh-CN"/>
@@ -608,7 +602,7 @@
     </w:tbl>
     <w:p>
       <w:pPr>
-        <w:spacing w:before="170" w:after="20" w:line="360" w:lineRule="auto"/>
+        <w:spacing w:before="170" w:after="20"/>
       </w:pPr>
       <w:r>
         <w:rPr>
@@ -623,7 +617,7 @@
     </w:p>
     <w:p>
       <w:pPr>
-        <w:spacing w:after="40" w:line="360" w:lineRule="auto"/>
+        <w:spacing w:after="40"/>
       </w:pPr>
       <w:r>
         <w:rPr>
@@ -676,9 +670,6 @@
             </w:tcMar>
           </w:tcPr>
           <w:p>
-            <w:pPr>
-              <w:spacing w:line="360" w:lineRule="auto"/>
-            </w:pPr>
             <w:r>
               <w:t>I built the application logic and evaluation code while using an existing hosted model API rather than training a foundation model from scratch. The OpenRouter API model mode uses openai/gpt-4o-mini for model calls. The retrieval pipeline reads versioned Markdown policy files and uses document chunks, Chinese bigrams, English tokens, aliases, TF-IDF, and cosine similarity in Python. The final version runs as a local browser application: run python3 server.py and open http://127.0.0.1:8765. It demonstrates the core AI workflow with an English interface rather than a production deployment.</w:t>
               <w:br/>
@@ -691,7 +682,7 @@
     </w:tbl>
     <w:p>
       <w:pPr>
-        <w:spacing w:before="170" w:after="20" w:line="360" w:lineRule="auto"/>
+        <w:spacing w:before="170" w:after="20"/>
       </w:pPr>
       <w:r>
         <w:rPr>
@@ -706,7 +697,7 @@
     </w:p>
     <w:p>
       <w:pPr>
-        <w:spacing w:after="40" w:line="360" w:lineRule="auto"/>
+        <w:spacing w:after="40"/>
       </w:pPr>
       <w:r>
         <w:rPr>
@@ -757,7 +748,6 @@
           </w:tcPr>
           <w:p>
             <w:pPr>
-              <w:spacing w:line="360" w:lineRule="auto"/>
               <w:rPr>
                 <w:rFonts w:hint="default" w:ascii="Times New Roman Regular" w:hAnsi="Times New Roman Regular" w:cs="Times New Roman Regular"/>
               </w:rPr>
@@ -797,7 +787,7 @@
     </w:tbl>
     <w:p>
       <w:pPr>
-        <w:spacing w:before="170" w:after="20" w:line="360" w:lineRule="auto"/>
+        <w:spacing w:before="170" w:after="20"/>
       </w:pPr>
       <w:r>
         <w:rPr>
@@ -812,7 +802,7 @@
     </w:p>
     <w:p>
       <w:pPr>
-        <w:spacing w:after="40" w:line="360" w:lineRule="auto"/>
+        <w:spacing w:after="40"/>
       </w:pPr>
       <w:r>
         <w:rPr>
@@ -863,7 +853,6 @@
           </w:tcPr>
           <w:p>
             <w:pPr>
-              <w:spacing w:line="360" w:lineRule="auto"/>
               <w:rPr>
                 <w:rFonts w:hint="default" w:ascii="Times New Roman Regular" w:hAnsi="Times New Roman Regular" w:cs="Times New Roman Regular"/>
               </w:rPr>
@@ -949,7 +938,7 @@
     </w:tbl>
     <w:p>
       <w:pPr>
-        <w:spacing w:before="170" w:after="20" w:line="360" w:lineRule="auto"/>
+        <w:spacing w:before="170" w:after="20"/>
       </w:pPr>
       <w:r>
         <w:rPr>
@@ -964,7 +953,7 @@
     </w:p>
     <w:p>
       <w:pPr>
-        <w:spacing w:after="40" w:line="360" w:lineRule="auto"/>
+        <w:spacing w:after="40"/>
       </w:pPr>
       <w:r>
         <w:rPr>
@@ -1018,7 +1007,6 @@
           </w:tcPr>
           <w:p>
             <w:pPr>
-              <w:spacing w:line="360" w:lineRule="auto"/>
               <w:rPr>
                 <w:rFonts w:hint="default" w:ascii="Times New Roman Regular" w:hAnsi="Times New Roman Regular" w:cs="Times New Roman Regular"/>
               </w:rPr>
@@ -1081,7 +1069,7 @@
     </w:tbl>
     <w:p>
       <w:pPr>
-        <w:spacing w:before="170" w:after="20" w:line="360" w:lineRule="auto"/>
+        <w:spacing w:before="170" w:after="20"/>
       </w:pPr>
       <w:r>
         <w:rPr>
@@ -1096,7 +1084,7 @@
     </w:p>
     <w:p>
       <w:pPr>
-        <w:spacing w:after="40" w:line="360" w:lineRule="auto"/>
+        <w:spacing w:after="40"/>
       </w:pPr>
       <w:r>
         <w:rPr>
@@ -1147,7 +1135,6 @@
           </w:tcPr>
           <w:p>
             <w:pPr>
-              <w:spacing w:line="360" w:lineRule="auto"/>
               <w:rPr>
                 <w:rFonts w:hint="default" w:ascii="Times New Roman Regular" w:hAnsi="Times New Roman Regular" w:cs="Times New Roman Regular"/>
               </w:rPr>
@@ -1164,7 +1151,7 @@
     </w:tbl>
     <w:p>
       <w:pPr>
-        <w:spacing w:before="170" w:after="40" w:line="360" w:lineRule="auto"/>
+        <w:spacing w:before="170" w:after="40"/>
       </w:pPr>
       <w:r>
         <w:rPr>
@@ -1177,7 +1164,7 @@
     </w:p>
     <w:p>
       <w:pPr>
-        <w:spacing w:after="40" w:line="360" w:lineRule="auto"/>
+        <w:spacing w:after="40"/>
       </w:pPr>
       <w:r>
         <w:rPr>
@@ -1192,12 +1179,12 @@
         <w:pBdr>
           <w:bottom w:val="single" w:color="D51A47" w:sz="8" w:space="0"/>
         </w:pBdr>
-        <w:spacing w:before="200" w:line="360" w:lineRule="auto"/>
-      </w:pPr>
-    </w:p>
-    <w:p>
-      <w:pPr>
-        <w:spacing w:before="120" w:after="6" w:line="360" w:lineRule="auto"/>
+        <w:spacing w:before="200"/>
+      </w:pPr>
+    </w:p>
+    <w:p>
+      <w:pPr>
+        <w:spacing w:before="120" w:after="6"/>
       </w:pPr>
       <w:r>
         <w:rPr>
@@ -1212,7 +1199,7 @@
     </w:p>
     <w:p>
       <w:pPr>
-        <w:spacing w:after="40" w:line="360" w:lineRule="auto"/>
+        <w:spacing w:after="40"/>
       </w:pPr>
       <w:r>
         <w:rPr>
@@ -1225,11 +1212,52 @@
         <w:t>For marker use — formative comments on the problem &amp; significance (criterion 1) and the business/technical trade-offs (criterion 2), plus one thing to strengthen before the final project.</w:t>
       </w:r>
     </w:p>
-    <w:p>
-      <w:pPr>
-        <w:spacing w:line="360" w:lineRule="auto"/>
-      </w:pPr>
-    </w:p>
+    <w:tbl>
+      <w:tblPr>
+        <w:tblStyle w:val="11"/>
+        <w:tblW w:w="9026" w:type="dxa"/>
+        <w:tblInd w:w="0" w:type="dxa"/>
+        <w:tblBorders>
+          <w:top w:val="single" w:color="auto" w:sz="4" w:space="0"/>
+          <w:left w:val="single" w:color="auto" w:sz="4" w:space="0"/>
+          <w:bottom w:val="single" w:color="auto" w:sz="4" w:space="0"/>
+          <w:right w:val="single" w:color="auto" w:sz="4" w:space="0"/>
+          <w:insideH w:val="single" w:color="auto" w:sz="4" w:space="0"/>
+          <w:insideV w:val="single" w:color="auto" w:sz="4" w:space="0"/>
+        </w:tblBorders>
+        <w:tblLayout w:type="autofit"/>
+        <w:tblCellMar>
+          <w:top w:w="0" w:type="dxa"/>
+          <w:left w:w="10" w:type="dxa"/>
+          <w:bottom w:w="0" w:type="dxa"/>
+          <w:right w:w="10" w:type="dxa"/>
+        </w:tblCellMar>
+      </w:tblPr>
+      <w:tblGrid>
+        <w:gridCol w:w="9026"/>
+      </w:tblGrid>
+      <w:tr>
+        <w:tc>
+          <w:tcPr>
+            <w:tcW w:w="9026" w:type="dxa"/>
+            <w:shd w:val="clear" w:color="auto" w:fill="FAFBFD"/>
+            <w:tcMar>
+              <w:top w:w="60" w:type="dxa"/>
+              <w:left w:w="120" w:type="dxa"/>
+              <w:bottom w:w="60" w:type="dxa"/>
+              <w:right w:w="120" w:type="dxa"/>
+            </w:tcMar>
+          </w:tcPr>
+          <w:p/>
+          <w:p/>
+          <w:p/>
+          <w:p/>
+          <w:p/>
+          <w:p/>
+        </w:tc>
+      </w:tr>
+    </w:tbl>
+    <w:p/>
     <w:sectPr>
       <w:headerReference r:id="rId3" w:type="default"/>
       <w:footerReference r:id="rId4" w:type="default"/>

</xml_diff>